<commit_message>
feat(forms): add QR and voice Word filling with source Docker deployment
Map reviewed scan/form markers, protect draft edits, improve QR capture and parsing, and add regression tests.

Add scoped server source-build override and guarded PowerShell workflow; exclude private build environments. Docker image build and server rollout are not yet run.
</commit_message>
<xml_diff>
--- a/thesis/refs/forms/Giấy đăng ký khai sinh.docx
+++ b/thesis/refs/forms/Giấy đăng ký khai sinh.docx
@@ -234,7 +234,7 @@
                 <w:szCs w:val="26"/>
                 <w:lang w:val="nl-NL"/>
               </w:rPr>
-              <w:t>{{field_1}}</w:t>
+              <w:t>{{form_1}}</w:t>
             </w:r>
           </w:p>
           <w:p>
@@ -314,16 +314,34 @@
                 <w:szCs w:val="26"/>
                 <w:lang w:val="nl-NL"/>
               </w:rPr>
-              <w:t>{{field_</w:t>
-            </w:r>
-            <w:r>
-              <w:rPr>
-                <w:bCs/>
-                <w:sz w:val="26"/>
-                <w:szCs w:val="26"/>
-                <w:lang w:val="nl-NL"/>
-              </w:rPr>
-              <w:t>2</w:t>
+              <w:t>{{</w:t>
+            </w:r>
+            <w:r>
+              <w:rPr>
+                <w:bCs/>
+                <w:sz w:val="26"/>
+                <w:szCs w:val="26"/>
+                <w:lang w:val="nl-NL"/>
+              </w:rPr>
+              <w:t>scan_ho</w:t>
+            </w:r>
+            <w:r>
+              <w:rPr>
+                <w:bCs/>
+                <w:sz w:val="26"/>
+                <w:szCs w:val="26"/>
+                <w:lang w:val="nl-NL"/>
+              </w:rPr>
+              <w:t>_</w:t>
+            </w:r>
+            <w:r>
+              <w:rPr>
+                <w:bCs/>
+                <w:sz w:val="26"/>
+                <w:szCs w:val="26"/>
+                <w:lang w:val="nl-NL"/>
+              </w:rPr>
+              <w:t>ten</w:t>
             </w:r>
             <w:r>
               <w:rPr>
@@ -374,16 +392,16 @@
                 <w:szCs w:val="26"/>
                 <w:lang w:val="nl-NL"/>
               </w:rPr>
-              <w:t>{{field_</w:t>
-            </w:r>
-            <w:r>
-              <w:rPr>
-                <w:bCs/>
-                <w:sz w:val="26"/>
-                <w:szCs w:val="26"/>
-                <w:lang w:val="nl-NL"/>
-              </w:rPr>
-              <w:t>3</w:t>
+              <w:t>{{</w:t>
+            </w:r>
+            <w:r>
+              <w:rPr>
+                <w:bCs/>
+                <w:sz w:val="26"/>
+                <w:szCs w:val="26"/>
+                <w:lang w:val="nl-NL"/>
+              </w:rPr>
+              <w:t>scan_ngay_sinh</w:t>
             </w:r>
             <w:r>
               <w:rPr>
@@ -438,14 +456,14 @@
                 <w:bCs/>
                 <w:lang w:val="nl-NL"/>
               </w:rPr>
-              <w:t>{{field_</w:t>
-            </w:r>
-            <w:r>
-              <w:rPr>
-                <w:bCs/>
-                <w:lang w:val="nl-NL"/>
-              </w:rPr>
-              <w:t>4</w:t>
+              <w:t>{{</w:t>
+            </w:r>
+            <w:r>
+              <w:rPr>
+                <w:bCs/>
+                <w:lang w:val="nl-NL"/>
+              </w:rPr>
+              <w:t>scan_dia_chi</w:t>
             </w:r>
             <w:r>
               <w:rPr>
@@ -502,16 +520,16 @@
                 <w:szCs w:val="26"/>
                 <w:lang w:val="nl-NL"/>
               </w:rPr>
-              <w:t>{{field_</w:t>
-            </w:r>
-            <w:r>
-              <w:rPr>
-                <w:bCs/>
-                <w:sz w:val="26"/>
-                <w:szCs w:val="26"/>
-                <w:lang w:val="nl-NL"/>
-              </w:rPr>
-              <w:t>5</w:t>
+              <w:t>{{</w:t>
+            </w:r>
+            <w:r>
+              <w:rPr>
+                <w:bCs/>
+                <w:sz w:val="26"/>
+                <w:szCs w:val="26"/>
+                <w:lang w:val="nl-NL"/>
+              </w:rPr>
+              <w:t>scan_cccd</w:t>
             </w:r>
             <w:r>
               <w:rPr>
@@ -553,25 +571,25 @@
                 <w:szCs w:val="26"/>
                 <w:lang w:val="nl-NL"/>
               </w:rPr>
-              <w:t>{{field_</w:t>
-            </w:r>
-            <w:r>
-              <w:rPr>
-                <w:bCs/>
-                <w:sz w:val="26"/>
-                <w:szCs w:val="26"/>
-                <w:lang w:val="nl-NL"/>
-              </w:rPr>
-              <w:t>6</w:t>
-            </w:r>
-            <w:r>
-              <w:rPr>
-                <w:bCs/>
-                <w:sz w:val="26"/>
-                <w:szCs w:val="26"/>
-                <w:lang w:val="nl-NL"/>
-              </w:rPr>
-              <w:t>}}</w:t>
+              <w:t>{{form_6}}</w:t>
+            </w:r>
+            <w:r>
+              <w:rPr>
+                <w:bCs/>
+                <w:sz w:val="26"/>
+                <w:szCs w:val="26"/>
+                <w:lang w:val="nl-NL"/>
+              </w:rPr>
+              <w:t/>
+            </w:r>
+            <w:r>
+              <w:rPr>
+                <w:bCs/>
+                <w:sz w:val="26"/>
+                <w:szCs w:val="26"/>
+                <w:lang w:val="nl-NL"/>
+              </w:rPr>
+              <w:t/>
             </w:r>
           </w:p>
           <w:p>
@@ -659,23 +677,23 @@
                 <w:szCs w:val="26"/>
                 <w:lang w:val="nl-NL"/>
               </w:rPr>
-              <w:t>{{field_</w:t>
-            </w:r>
-            <w:r>
-              <w:rPr>
-                <w:sz w:val="26"/>
-                <w:szCs w:val="26"/>
-                <w:lang w:val="nl-NL"/>
-              </w:rPr>
-              <w:t>7</w:t>
-            </w:r>
-            <w:r>
-              <w:rPr>
-                <w:sz w:val="26"/>
-                <w:szCs w:val="26"/>
-                <w:lang w:val="nl-NL"/>
-              </w:rPr>
-              <w:t>}}</w:t>
+              <w:t>{{form_7}}</w:t>
+            </w:r>
+            <w:r>
+              <w:rPr>
+                <w:sz w:val="26"/>
+                <w:szCs w:val="26"/>
+                <w:lang w:val="nl-NL"/>
+              </w:rPr>
+              <w:t/>
+            </w:r>
+            <w:r>
+              <w:rPr>
+                <w:sz w:val="26"/>
+                <w:szCs w:val="26"/>
+                <w:lang w:val="nl-NL"/>
+              </w:rPr>
+              <w:t/>
             </w:r>
           </w:p>
           <w:p>
@@ -708,25 +726,25 @@
                 <w:szCs w:val="26"/>
                 <w:lang w:val="nl-NL"/>
               </w:rPr>
-              <w:t>{{field_</w:t>
-            </w:r>
-            <w:r>
-              <w:rPr>
-                <w:bCs/>
-                <w:sz w:val="26"/>
-                <w:szCs w:val="26"/>
-                <w:lang w:val="nl-NL"/>
-              </w:rPr>
-              <w:t>8</w:t>
-            </w:r>
-            <w:r>
-              <w:rPr>
-                <w:bCs/>
-                <w:sz w:val="26"/>
-                <w:szCs w:val="26"/>
-                <w:lang w:val="nl-NL"/>
-              </w:rPr>
-              <w:t>}}</w:t>
+              <w:t>{{form_8}}</w:t>
+            </w:r>
+            <w:r>
+              <w:rPr>
+                <w:bCs/>
+                <w:sz w:val="26"/>
+                <w:szCs w:val="26"/>
+                <w:lang w:val="nl-NL"/>
+              </w:rPr>
+              <w:t/>
+            </w:r>
+            <w:r>
+              <w:rPr>
+                <w:bCs/>
+                <w:sz w:val="26"/>
+                <w:szCs w:val="26"/>
+                <w:lang w:val="nl-NL"/>
+              </w:rPr>
+              <w:t/>
             </w:r>
             <w:r>
               <w:rPr>
@@ -753,25 +771,25 @@
                 <w:szCs w:val="26"/>
                 <w:lang w:val="nl-NL"/>
               </w:rPr>
-              <w:t>{{field_</w:t>
-            </w:r>
-            <w:r>
-              <w:rPr>
-                <w:bCs/>
-                <w:sz w:val="26"/>
-                <w:szCs w:val="26"/>
-                <w:lang w:val="nl-NL"/>
-              </w:rPr>
-              <w:t>9</w:t>
-            </w:r>
-            <w:r>
-              <w:rPr>
-                <w:bCs/>
-                <w:sz w:val="26"/>
-                <w:szCs w:val="26"/>
-                <w:lang w:val="nl-NL"/>
-              </w:rPr>
-              <w:t>}}</w:t>
+              <w:t>{{form_9}}</w:t>
+            </w:r>
+            <w:r>
+              <w:rPr>
+                <w:bCs/>
+                <w:sz w:val="26"/>
+                <w:szCs w:val="26"/>
+                <w:lang w:val="nl-NL"/>
+              </w:rPr>
+              <w:t/>
+            </w:r>
+            <w:r>
+              <w:rPr>
+                <w:bCs/>
+                <w:sz w:val="26"/>
+                <w:szCs w:val="26"/>
+                <w:lang w:val="nl-NL"/>
+              </w:rPr>
+              <w:t/>
             </w:r>
           </w:p>
           <w:p>
@@ -813,25 +831,25 @@
                 <w:szCs w:val="26"/>
                 <w:lang w:val="nl-NL"/>
               </w:rPr>
-              <w:t>{{field_1</w:t>
-            </w:r>
-            <w:r>
-              <w:rPr>
-                <w:bCs/>
-                <w:sz w:val="26"/>
-                <w:szCs w:val="26"/>
-                <w:lang w:val="nl-NL"/>
-              </w:rPr>
-              <w:t>0</w:t>
-            </w:r>
-            <w:r>
-              <w:rPr>
-                <w:bCs/>
-                <w:sz w:val="26"/>
-                <w:szCs w:val="26"/>
-                <w:lang w:val="nl-NL"/>
-              </w:rPr>
-              <w:t>}}</w:t>
+              <w:t>{{form_10}}</w:t>
+            </w:r>
+            <w:r>
+              <w:rPr>
+                <w:bCs/>
+                <w:sz w:val="26"/>
+                <w:szCs w:val="26"/>
+                <w:lang w:val="nl-NL"/>
+              </w:rPr>
+              <w:t/>
+            </w:r>
+            <w:r>
+              <w:rPr>
+                <w:bCs/>
+                <w:sz w:val="26"/>
+                <w:szCs w:val="26"/>
+                <w:lang w:val="nl-NL"/>
+              </w:rPr>
+              <w:t/>
             </w:r>
             <w:r>
               <w:rPr>
@@ -858,25 +876,25 @@
                 <w:szCs w:val="26"/>
                 <w:lang w:val="nl-NL"/>
               </w:rPr>
-              <w:t>{{field_1</w:t>
-            </w:r>
-            <w:r>
-              <w:rPr>
-                <w:bCs/>
-                <w:sz w:val="26"/>
-                <w:szCs w:val="26"/>
-                <w:lang w:val="nl-NL"/>
-              </w:rPr>
-              <w:t>1</w:t>
-            </w:r>
-            <w:r>
-              <w:rPr>
-                <w:bCs/>
-                <w:sz w:val="26"/>
-                <w:szCs w:val="26"/>
-                <w:lang w:val="nl-NL"/>
-              </w:rPr>
-              <w:t>}}</w:t>
+              <w:t>{{form_11}}</w:t>
+            </w:r>
+            <w:r>
+              <w:rPr>
+                <w:bCs/>
+                <w:sz w:val="26"/>
+                <w:szCs w:val="26"/>
+                <w:lang w:val="nl-NL"/>
+              </w:rPr>
+              <w:t/>
+            </w:r>
+            <w:r>
+              <w:rPr>
+                <w:bCs/>
+                <w:sz w:val="26"/>
+                <w:szCs w:val="26"/>
+                <w:lang w:val="nl-NL"/>
+              </w:rPr>
+              <w:t/>
             </w:r>
             <w:r>
               <w:rPr>
@@ -903,25 +921,25 @@
                 <w:szCs w:val="26"/>
                 <w:lang w:val="nl-NL"/>
               </w:rPr>
-              <w:t>{{field_1</w:t>
-            </w:r>
-            <w:r>
-              <w:rPr>
-                <w:bCs/>
-                <w:sz w:val="26"/>
-                <w:szCs w:val="26"/>
-                <w:lang w:val="nl-NL"/>
-              </w:rPr>
-              <w:t>2</w:t>
-            </w:r>
-            <w:r>
-              <w:rPr>
-                <w:bCs/>
-                <w:sz w:val="26"/>
-                <w:szCs w:val="26"/>
-                <w:lang w:val="nl-NL"/>
-              </w:rPr>
-              <w:t>}}</w:t>
+              <w:t>{{form_12}}</w:t>
+            </w:r>
+            <w:r>
+              <w:rPr>
+                <w:bCs/>
+                <w:sz w:val="26"/>
+                <w:szCs w:val="26"/>
+                <w:lang w:val="nl-NL"/>
+              </w:rPr>
+              <w:t/>
+            </w:r>
+            <w:r>
+              <w:rPr>
+                <w:bCs/>
+                <w:sz w:val="26"/>
+                <w:szCs w:val="26"/>
+                <w:lang w:val="nl-NL"/>
+              </w:rPr>
+              <w:t/>
             </w:r>
           </w:p>
           <w:p>
@@ -964,25 +982,25 @@
                 <w:szCs w:val="26"/>
                 <w:lang w:val="nl-NL"/>
               </w:rPr>
-              <w:t>{{field_</w:t>
-            </w:r>
-            <w:r>
-              <w:rPr>
-                <w:bCs/>
-                <w:sz w:val="26"/>
-                <w:szCs w:val="26"/>
-                <w:lang w:val="nl-NL"/>
-              </w:rPr>
-              <w:t>13</w:t>
-            </w:r>
-            <w:r>
-              <w:rPr>
-                <w:bCs/>
-                <w:sz w:val="26"/>
-                <w:szCs w:val="26"/>
-                <w:lang w:val="nl-NL"/>
-              </w:rPr>
-              <w:t>}}</w:t>
+              <w:t>{{form_13}}</w:t>
+            </w:r>
+            <w:r>
+              <w:rPr>
+                <w:bCs/>
+                <w:sz w:val="26"/>
+                <w:szCs w:val="26"/>
+                <w:lang w:val="nl-NL"/>
+              </w:rPr>
+              <w:t/>
+            </w:r>
+            <w:r>
+              <w:rPr>
+                <w:bCs/>
+                <w:sz w:val="26"/>
+                <w:szCs w:val="26"/>
+                <w:lang w:val="nl-NL"/>
+              </w:rPr>
+              <w:t/>
             </w:r>
           </w:p>
           <w:p>
@@ -1015,25 +1033,25 @@
                 <w:szCs w:val="26"/>
                 <w:lang w:val="nl-NL"/>
               </w:rPr>
-              <w:t>{{field_1</w:t>
-            </w:r>
-            <w:r>
-              <w:rPr>
-                <w:bCs/>
-                <w:sz w:val="26"/>
-                <w:szCs w:val="26"/>
-                <w:lang w:val="nl-NL"/>
-              </w:rPr>
-              <w:t>4</w:t>
-            </w:r>
-            <w:r>
-              <w:rPr>
-                <w:bCs/>
-                <w:sz w:val="26"/>
-                <w:szCs w:val="26"/>
-                <w:lang w:val="nl-NL"/>
-              </w:rPr>
-              <w:t>}}</w:t>
+              <w:t>{{form_14}}</w:t>
+            </w:r>
+            <w:r>
+              <w:rPr>
+                <w:bCs/>
+                <w:sz w:val="26"/>
+                <w:szCs w:val="26"/>
+                <w:lang w:val="nl-NL"/>
+              </w:rPr>
+              <w:t/>
+            </w:r>
+            <w:r>
+              <w:rPr>
+                <w:bCs/>
+                <w:sz w:val="26"/>
+                <w:szCs w:val="26"/>
+                <w:lang w:val="nl-NL"/>
+              </w:rPr>
+              <w:t/>
             </w:r>
           </w:p>
           <w:p>
@@ -1076,25 +1094,25 @@
                 <w:szCs w:val="26"/>
                 <w:lang w:val="nl-NL"/>
               </w:rPr>
-              <w:t>{{field_1</w:t>
-            </w:r>
-            <w:r>
-              <w:rPr>
-                <w:bCs/>
-                <w:sz w:val="26"/>
-                <w:szCs w:val="26"/>
-                <w:lang w:val="nl-NL"/>
-              </w:rPr>
-              <w:t>5</w:t>
-            </w:r>
-            <w:r>
-              <w:rPr>
-                <w:bCs/>
-                <w:sz w:val="26"/>
-                <w:szCs w:val="26"/>
-                <w:lang w:val="nl-NL"/>
-              </w:rPr>
-              <w:t>}}</w:t>
+              <w:t>{{form_15}}</w:t>
+            </w:r>
+            <w:r>
+              <w:rPr>
+                <w:bCs/>
+                <w:sz w:val="26"/>
+                <w:szCs w:val="26"/>
+                <w:lang w:val="nl-NL"/>
+              </w:rPr>
+              <w:t/>
+            </w:r>
+            <w:r>
+              <w:rPr>
+                <w:bCs/>
+                <w:sz w:val="26"/>
+                <w:szCs w:val="26"/>
+                <w:lang w:val="nl-NL"/>
+              </w:rPr>
+              <w:t/>
             </w:r>
           </w:p>
           <w:p>
@@ -1147,25 +1165,25 @@
                 <w:szCs w:val="26"/>
                 <w:lang w:val="nl-NL"/>
               </w:rPr>
-              <w:t>{{field_1</w:t>
-            </w:r>
-            <w:r>
-              <w:rPr>
-                <w:bCs/>
-                <w:sz w:val="26"/>
-                <w:szCs w:val="26"/>
-                <w:lang w:val="nl-NL"/>
-              </w:rPr>
-              <w:t>6</w:t>
-            </w:r>
-            <w:r>
-              <w:rPr>
-                <w:bCs/>
-                <w:sz w:val="26"/>
-                <w:szCs w:val="26"/>
-                <w:lang w:val="nl-NL"/>
-              </w:rPr>
-              <w:t>}}</w:t>
+              <w:t>{{form_16}}</w:t>
+            </w:r>
+            <w:r>
+              <w:rPr>
+                <w:bCs/>
+                <w:sz w:val="26"/>
+                <w:szCs w:val="26"/>
+                <w:lang w:val="nl-NL"/>
+              </w:rPr>
+              <w:t/>
+            </w:r>
+            <w:r>
+              <w:rPr>
+                <w:bCs/>
+                <w:sz w:val="26"/>
+                <w:szCs w:val="26"/>
+                <w:lang w:val="nl-NL"/>
+              </w:rPr>
+              <w:t/>
             </w:r>
             <w:r>
               <w:rPr>
@@ -1225,16 +1243,16 @@
                 <w:szCs w:val="26"/>
                 <w:lang w:val="nl-NL"/>
               </w:rPr>
-              <w:t>{{field_1</w:t>
-            </w:r>
-            <w:r>
-              <w:rPr>
-                <w:bCs/>
-                <w:sz w:val="26"/>
-                <w:szCs w:val="26"/>
-                <w:lang w:val="nl-NL"/>
-              </w:rPr>
-              <w:t xml:space="preserve">7}} </w:t>
+              <w:t>{{form_17}}</w:t>
+            </w:r>
+            <w:r>
+              <w:rPr>
+                <w:bCs/>
+                <w:sz w:val="26"/>
+                <w:szCs w:val="26"/>
+                <w:lang w:val="nl-NL"/>
+              </w:rPr>
+              <w:t xml:space="preserve"> </w:t>
             </w:r>
             <w:r>
               <w:rPr>
@@ -1275,25 +1293,25 @@
                 <w:szCs w:val="26"/>
                 <w:lang w:val="nl-NL"/>
               </w:rPr>
-              <w:t>{{field_1</w:t>
-            </w:r>
-            <w:r>
-              <w:rPr>
-                <w:bCs/>
-                <w:sz w:val="26"/>
-                <w:szCs w:val="26"/>
-                <w:lang w:val="nl-NL"/>
-              </w:rPr>
-              <w:t>8</w:t>
-            </w:r>
-            <w:r>
-              <w:rPr>
-                <w:bCs/>
-                <w:sz w:val="26"/>
-                <w:szCs w:val="26"/>
-                <w:lang w:val="nl-NL"/>
-              </w:rPr>
-              <w:t>}}</w:t>
+              <w:t>{{form_18}}</w:t>
+            </w:r>
+            <w:r>
+              <w:rPr>
+                <w:bCs/>
+                <w:sz w:val="26"/>
+                <w:szCs w:val="26"/>
+                <w:lang w:val="nl-NL"/>
+              </w:rPr>
+              <w:t/>
+            </w:r>
+            <w:r>
+              <w:rPr>
+                <w:bCs/>
+                <w:sz w:val="26"/>
+                <w:szCs w:val="26"/>
+                <w:lang w:val="nl-NL"/>
+              </w:rPr>
+              <w:t/>
             </w:r>
             <w:r>
               <w:rPr>
@@ -1368,25 +1386,25 @@
                 <w:szCs w:val="26"/>
                 <w:lang w:val="nl-NL"/>
               </w:rPr>
-              <w:t>{{field_1</w:t>
-            </w:r>
-            <w:r>
-              <w:rPr>
-                <w:bCs/>
-                <w:sz w:val="26"/>
-                <w:szCs w:val="26"/>
-                <w:lang w:val="nl-NL"/>
-              </w:rPr>
-              <w:t>9</w:t>
-            </w:r>
-            <w:r>
-              <w:rPr>
-                <w:bCs/>
-                <w:sz w:val="26"/>
-                <w:szCs w:val="26"/>
-                <w:lang w:val="nl-NL"/>
-              </w:rPr>
-              <w:t>}}</w:t>
+              <w:t>{{form_19}}</w:t>
+            </w:r>
+            <w:r>
+              <w:rPr>
+                <w:bCs/>
+                <w:sz w:val="26"/>
+                <w:szCs w:val="26"/>
+                <w:lang w:val="nl-NL"/>
+              </w:rPr>
+              <w:t/>
+            </w:r>
+            <w:r>
+              <w:rPr>
+                <w:bCs/>
+                <w:sz w:val="26"/>
+                <w:szCs w:val="26"/>
+                <w:lang w:val="nl-NL"/>
+              </w:rPr>
+              <w:t/>
             </w:r>
           </w:p>
           <w:p>
@@ -1427,25 +1445,25 @@
                 <w:szCs w:val="26"/>
                 <w:lang w:val="nl-NL"/>
               </w:rPr>
-              <w:t>{{field_</w:t>
-            </w:r>
-            <w:r>
-              <w:rPr>
-                <w:bCs/>
-                <w:sz w:val="26"/>
-                <w:szCs w:val="26"/>
-                <w:lang w:val="nl-NL"/>
-              </w:rPr>
-              <w:t>20</w:t>
-            </w:r>
-            <w:r>
-              <w:rPr>
-                <w:bCs/>
-                <w:sz w:val="26"/>
-                <w:szCs w:val="26"/>
-                <w:lang w:val="nl-NL"/>
-              </w:rPr>
-              <w:t>}}</w:t>
+              <w:t>{{form_20}}</w:t>
+            </w:r>
+            <w:r>
+              <w:rPr>
+                <w:bCs/>
+                <w:sz w:val="26"/>
+                <w:szCs w:val="26"/>
+                <w:lang w:val="nl-NL"/>
+              </w:rPr>
+              <w:t/>
+            </w:r>
+            <w:r>
+              <w:rPr>
+                <w:bCs/>
+                <w:sz w:val="26"/>
+                <w:szCs w:val="26"/>
+                <w:lang w:val="nl-NL"/>
+              </w:rPr>
+              <w:t/>
             </w:r>
           </w:p>
           <w:p>
@@ -1488,25 +1506,25 @@
                 <w:szCs w:val="26"/>
                 <w:lang w:val="nl-NL"/>
               </w:rPr>
-              <w:t>{{field_</w:t>
-            </w:r>
-            <w:r>
-              <w:rPr>
-                <w:bCs/>
-                <w:sz w:val="26"/>
-                <w:szCs w:val="26"/>
-                <w:lang w:val="nl-NL"/>
-              </w:rPr>
-              <w:t>21</w:t>
-            </w:r>
-            <w:r>
-              <w:rPr>
-                <w:bCs/>
-                <w:sz w:val="26"/>
-                <w:szCs w:val="26"/>
-                <w:lang w:val="nl-NL"/>
-              </w:rPr>
-              <w:t>}}</w:t>
+              <w:t>{{form_21}}</w:t>
+            </w:r>
+            <w:r>
+              <w:rPr>
+                <w:bCs/>
+                <w:sz w:val="26"/>
+                <w:szCs w:val="26"/>
+                <w:lang w:val="nl-NL"/>
+              </w:rPr>
+              <w:t/>
+            </w:r>
+            <w:r>
+              <w:rPr>
+                <w:bCs/>
+                <w:sz w:val="26"/>
+                <w:szCs w:val="26"/>
+                <w:lang w:val="nl-NL"/>
+              </w:rPr>
+              <w:t/>
             </w:r>
           </w:p>
           <w:p>
@@ -1559,25 +1577,25 @@
                 <w:szCs w:val="26"/>
                 <w:lang w:val="nl-NL"/>
               </w:rPr>
-              <w:t>{{field_2</w:t>
-            </w:r>
-            <w:r>
-              <w:rPr>
-                <w:bCs/>
-                <w:sz w:val="26"/>
-                <w:szCs w:val="26"/>
-                <w:lang w:val="nl-NL"/>
-              </w:rPr>
-              <w:t>2</w:t>
-            </w:r>
-            <w:r>
-              <w:rPr>
-                <w:bCs/>
-                <w:sz w:val="26"/>
-                <w:szCs w:val="26"/>
-                <w:lang w:val="nl-NL"/>
-              </w:rPr>
-              <w:t>}}</w:t>
+              <w:t>{{form_22}}</w:t>
+            </w:r>
+            <w:r>
+              <w:rPr>
+                <w:bCs/>
+                <w:sz w:val="26"/>
+                <w:szCs w:val="26"/>
+                <w:lang w:val="nl-NL"/>
+              </w:rPr>
+              <w:t/>
+            </w:r>
+            <w:r>
+              <w:rPr>
+                <w:bCs/>
+                <w:sz w:val="26"/>
+                <w:szCs w:val="26"/>
+                <w:lang w:val="nl-NL"/>
+              </w:rPr>
+              <w:t/>
             </w:r>
             <w:r>
               <w:rPr>
@@ -1628,25 +1646,25 @@
                 <w:szCs w:val="26"/>
                 <w:lang w:val="nl-NL"/>
               </w:rPr>
-              <w:t>{{field_2</w:t>
-            </w:r>
-            <w:r>
-              <w:rPr>
-                <w:bCs/>
-                <w:sz w:val="26"/>
-                <w:szCs w:val="26"/>
-                <w:lang w:val="nl-NL"/>
-              </w:rPr>
-              <w:t>3</w:t>
-            </w:r>
-            <w:r>
-              <w:rPr>
-                <w:bCs/>
-                <w:sz w:val="26"/>
-                <w:szCs w:val="26"/>
-                <w:lang w:val="nl-NL"/>
-              </w:rPr>
-              <w:t>}}</w:t>
+              <w:t>{{form_23}}</w:t>
+            </w:r>
+            <w:r>
+              <w:rPr>
+                <w:bCs/>
+                <w:sz w:val="26"/>
+                <w:szCs w:val="26"/>
+                <w:lang w:val="nl-NL"/>
+              </w:rPr>
+              <w:t/>
+            </w:r>
+            <w:r>
+              <w:rPr>
+                <w:bCs/>
+                <w:sz w:val="26"/>
+                <w:szCs w:val="26"/>
+                <w:lang w:val="nl-NL"/>
+              </w:rPr>
+              <w:t/>
             </w:r>
             <w:r>
               <w:rPr>
@@ -1697,25 +1715,25 @@
                 <w:szCs w:val="26"/>
                 <w:lang w:val="nl-NL"/>
               </w:rPr>
-              <w:t>{{field_2</w:t>
-            </w:r>
-            <w:r>
-              <w:rPr>
-                <w:bCs/>
-                <w:sz w:val="26"/>
-                <w:szCs w:val="26"/>
-                <w:lang w:val="nl-NL"/>
-              </w:rPr>
-              <w:t>4</w:t>
-            </w:r>
-            <w:r>
-              <w:rPr>
-                <w:bCs/>
-                <w:sz w:val="26"/>
-                <w:szCs w:val="26"/>
-                <w:lang w:val="nl-NL"/>
-              </w:rPr>
-              <w:t>}}</w:t>
+              <w:t>{{form_24}}</w:t>
+            </w:r>
+            <w:r>
+              <w:rPr>
+                <w:bCs/>
+                <w:sz w:val="26"/>
+                <w:szCs w:val="26"/>
+                <w:lang w:val="nl-NL"/>
+              </w:rPr>
+              <w:t/>
+            </w:r>
+            <w:r>
+              <w:rPr>
+                <w:bCs/>
+                <w:sz w:val="26"/>
+                <w:szCs w:val="26"/>
+                <w:lang w:val="nl-NL"/>
+              </w:rPr>
+              <w:t/>
             </w:r>
           </w:p>
           <w:p>
@@ -1772,25 +1790,25 @@
                 <w:szCs w:val="26"/>
                 <w:lang w:val="nl-NL"/>
               </w:rPr>
-              <w:t>{{field_2</w:t>
-            </w:r>
-            <w:r>
-              <w:rPr>
-                <w:bCs/>
-                <w:sz w:val="26"/>
-                <w:szCs w:val="26"/>
-                <w:lang w:val="nl-NL"/>
-              </w:rPr>
-              <w:t>5</w:t>
-            </w:r>
-            <w:r>
-              <w:rPr>
-                <w:bCs/>
-                <w:sz w:val="26"/>
-                <w:szCs w:val="26"/>
-                <w:lang w:val="nl-NL"/>
-              </w:rPr>
-              <w:t>}}</w:t>
+              <w:t>{{form_25}}</w:t>
+            </w:r>
+            <w:r>
+              <w:rPr>
+                <w:bCs/>
+                <w:sz w:val="26"/>
+                <w:szCs w:val="26"/>
+                <w:lang w:val="nl-NL"/>
+              </w:rPr>
+              <w:t/>
+            </w:r>
+            <w:r>
+              <w:rPr>
+                <w:bCs/>
+                <w:sz w:val="26"/>
+                <w:szCs w:val="26"/>
+                <w:lang w:val="nl-NL"/>
+              </w:rPr>
+              <w:t/>
             </w:r>
           </w:p>
           <w:p>
@@ -1831,25 +1849,25 @@
                 <w:szCs w:val="26"/>
                 <w:lang w:val="nl-NL"/>
               </w:rPr>
-              <w:t xml:space="preserve"> {{field_2</w:t>
-            </w:r>
-            <w:r>
-              <w:rPr>
-                <w:bCs/>
-                <w:sz w:val="26"/>
-                <w:szCs w:val="26"/>
-                <w:lang w:val="nl-NL"/>
-              </w:rPr>
-              <w:t>6</w:t>
-            </w:r>
-            <w:r>
-              <w:rPr>
-                <w:bCs/>
-                <w:sz w:val="26"/>
-                <w:szCs w:val="26"/>
-                <w:lang w:val="nl-NL"/>
-              </w:rPr>
-              <w:t>}}</w:t>
+              <w:t xml:space="preserve"> {{form_26}}</w:t>
+            </w:r>
+            <w:r>
+              <w:rPr>
+                <w:bCs/>
+                <w:sz w:val="26"/>
+                <w:szCs w:val="26"/>
+                <w:lang w:val="nl-NL"/>
+              </w:rPr>
+              <w:t/>
+            </w:r>
+            <w:r>
+              <w:rPr>
+                <w:bCs/>
+                <w:sz w:val="26"/>
+                <w:szCs w:val="26"/>
+                <w:lang w:val="nl-NL"/>
+              </w:rPr>
+              <w:t/>
             </w:r>
           </w:p>
           <w:p>
@@ -1882,25 +1900,25 @@
                 <w:szCs w:val="26"/>
                 <w:lang w:val="nl-NL"/>
               </w:rPr>
-              <w:t>{{field_2</w:t>
-            </w:r>
-            <w:r>
-              <w:rPr>
-                <w:bCs/>
-                <w:sz w:val="26"/>
-                <w:szCs w:val="26"/>
-                <w:lang w:val="nl-NL"/>
-              </w:rPr>
-              <w:t>7</w:t>
-            </w:r>
-            <w:r>
-              <w:rPr>
-                <w:bCs/>
-                <w:sz w:val="26"/>
-                <w:szCs w:val="26"/>
-                <w:lang w:val="nl-NL"/>
-              </w:rPr>
-              <w:t>}}</w:t>
+              <w:t>{{form_27}}</w:t>
+            </w:r>
+            <w:r>
+              <w:rPr>
+                <w:bCs/>
+                <w:sz w:val="26"/>
+                <w:szCs w:val="26"/>
+                <w:lang w:val="nl-NL"/>
+              </w:rPr>
+              <w:t/>
+            </w:r>
+            <w:r>
+              <w:rPr>
+                <w:bCs/>
+                <w:sz w:val="26"/>
+                <w:szCs w:val="26"/>
+                <w:lang w:val="nl-NL"/>
+              </w:rPr>
+              <w:t/>
             </w:r>
             <w:r>
               <w:rPr>
@@ -1918,25 +1936,25 @@
                 <w:szCs w:val="26"/>
                 <w:lang w:val="nl-NL"/>
               </w:rPr>
-              <w:t>{{field_2</w:t>
-            </w:r>
-            <w:r>
-              <w:rPr>
-                <w:bCs/>
-                <w:sz w:val="26"/>
-                <w:szCs w:val="26"/>
-                <w:lang w:val="nl-NL"/>
-              </w:rPr>
-              <w:t>8</w:t>
-            </w:r>
-            <w:r>
-              <w:rPr>
-                <w:bCs/>
-                <w:sz w:val="26"/>
-                <w:szCs w:val="26"/>
-                <w:lang w:val="nl-NL"/>
-              </w:rPr>
-              <w:t>}}</w:t>
+              <w:t>{{form_28}}</w:t>
+            </w:r>
+            <w:r>
+              <w:rPr>
+                <w:bCs/>
+                <w:sz w:val="26"/>
+                <w:szCs w:val="26"/>
+                <w:lang w:val="nl-NL"/>
+              </w:rPr>
+              <w:t/>
+            </w:r>
+            <w:r>
+              <w:rPr>
+                <w:bCs/>
+                <w:sz w:val="26"/>
+                <w:szCs w:val="26"/>
+                <w:lang w:val="nl-NL"/>
+              </w:rPr>
+              <w:t/>
             </w:r>
             <w:r>
               <w:rPr>
@@ -1954,25 +1972,25 @@
                 <w:szCs w:val="26"/>
                 <w:lang w:val="nl-NL"/>
               </w:rPr>
-              <w:t>{{field_2</w:t>
-            </w:r>
-            <w:r>
-              <w:rPr>
-                <w:bCs/>
-                <w:sz w:val="26"/>
-                <w:szCs w:val="26"/>
-                <w:lang w:val="nl-NL"/>
-              </w:rPr>
-              <w:t>9</w:t>
-            </w:r>
-            <w:r>
-              <w:rPr>
-                <w:bCs/>
-                <w:sz w:val="26"/>
-                <w:szCs w:val="26"/>
-                <w:lang w:val="nl-NL"/>
-              </w:rPr>
-              <w:t>}}</w:t>
+              <w:t>{{form_29}}</w:t>
+            </w:r>
+            <w:r>
+              <w:rPr>
+                <w:bCs/>
+                <w:sz w:val="26"/>
+                <w:szCs w:val="26"/>
+                <w:lang w:val="nl-NL"/>
+              </w:rPr>
+              <w:t/>
+            </w:r>
+            <w:r>
+              <w:rPr>
+                <w:bCs/>
+                <w:sz w:val="26"/>
+                <w:szCs w:val="26"/>
+                <w:lang w:val="nl-NL"/>
+              </w:rPr>
+              <w:t/>
             </w:r>
             <w:r>
               <w:rPr>
@@ -1990,25 +2008,25 @@
                 <w:szCs w:val="26"/>
                 <w:lang w:val="nl-NL"/>
               </w:rPr>
-              <w:t>{{field_</w:t>
-            </w:r>
-            <w:r>
-              <w:rPr>
-                <w:bCs/>
-                <w:sz w:val="26"/>
-                <w:szCs w:val="26"/>
-                <w:lang w:val="nl-NL"/>
-              </w:rPr>
-              <w:t>30</w:t>
-            </w:r>
-            <w:r>
-              <w:rPr>
-                <w:bCs/>
-                <w:sz w:val="26"/>
-                <w:szCs w:val="26"/>
-                <w:lang w:val="nl-NL"/>
-              </w:rPr>
-              <w:t>}}</w:t>
+              <w:t>{{form_30}}</w:t>
+            </w:r>
+            <w:r>
+              <w:rPr>
+                <w:bCs/>
+                <w:sz w:val="26"/>
+                <w:szCs w:val="26"/>
+                <w:lang w:val="nl-NL"/>
+              </w:rPr>
+              <w:t/>
+            </w:r>
+            <w:r>
+              <w:rPr>
+                <w:bCs/>
+                <w:sz w:val="26"/>
+                <w:szCs w:val="26"/>
+                <w:lang w:val="nl-NL"/>
+              </w:rPr>
+              <w:t/>
             </w:r>
             <w:r>
               <w:rPr>
@@ -2026,25 +2044,25 @@
                 <w:szCs w:val="26"/>
                 <w:lang w:val="nl-NL"/>
               </w:rPr>
-              <w:t>{{field_</w:t>
-            </w:r>
-            <w:r>
-              <w:rPr>
-                <w:bCs/>
-                <w:sz w:val="26"/>
-                <w:szCs w:val="26"/>
-                <w:lang w:val="nl-NL"/>
-              </w:rPr>
-              <w:t>3</w:t>
-            </w:r>
-            <w:r>
-              <w:rPr>
-                <w:bCs/>
-                <w:sz w:val="26"/>
-                <w:szCs w:val="26"/>
-                <w:lang w:val="nl-NL"/>
-              </w:rPr>
-              <w:t>1}}</w:t>
+              <w:t>{{form_31}}</w:t>
+            </w:r>
+            <w:r>
+              <w:rPr>
+                <w:bCs/>
+                <w:sz w:val="26"/>
+                <w:szCs w:val="26"/>
+                <w:lang w:val="nl-NL"/>
+              </w:rPr>
+              <w:t/>
+            </w:r>
+            <w:r>
+              <w:rPr>
+                <w:bCs/>
+                <w:sz w:val="26"/>
+                <w:szCs w:val="26"/>
+                <w:lang w:val="nl-NL"/>
+              </w:rPr>
+              <w:t/>
             </w:r>
             <w:r>
               <w:rPr>
@@ -2071,25 +2089,25 @@
                 <w:szCs w:val="26"/>
                 <w:lang w:val="nl-NL"/>
               </w:rPr>
-              <w:t>{{field_3</w:t>
-            </w:r>
-            <w:r>
-              <w:rPr>
-                <w:bCs/>
-                <w:sz w:val="26"/>
-                <w:szCs w:val="26"/>
-                <w:lang w:val="nl-NL"/>
-              </w:rPr>
-              <w:t>2</w:t>
-            </w:r>
-            <w:r>
-              <w:rPr>
-                <w:bCs/>
-                <w:sz w:val="26"/>
-                <w:szCs w:val="26"/>
-                <w:lang w:val="nl-NL"/>
-              </w:rPr>
-              <w:t>}}</w:t>
+              <w:t>{{form_32}}</w:t>
+            </w:r>
+            <w:r>
+              <w:rPr>
+                <w:bCs/>
+                <w:sz w:val="26"/>
+                <w:szCs w:val="26"/>
+                <w:lang w:val="nl-NL"/>
+              </w:rPr>
+              <w:t/>
+            </w:r>
+            <w:r>
+              <w:rPr>
+                <w:bCs/>
+                <w:sz w:val="26"/>
+                <w:szCs w:val="26"/>
+                <w:lang w:val="nl-NL"/>
+              </w:rPr>
+              <w:t/>
             </w:r>
           </w:p>
           <w:p>
@@ -2176,25 +2194,25 @@
                 <w:szCs w:val="26"/>
                 <w:lang w:val="nl-NL"/>
               </w:rPr>
-              <w:t>{{field_3</w:t>
-            </w:r>
-            <w:r>
-              <w:rPr>
-                <w:bCs/>
-                <w:sz w:val="26"/>
-                <w:szCs w:val="26"/>
-                <w:lang w:val="nl-NL"/>
-              </w:rPr>
-              <w:t>3</w:t>
-            </w:r>
-            <w:r>
-              <w:rPr>
-                <w:bCs/>
-                <w:sz w:val="26"/>
-                <w:szCs w:val="26"/>
-                <w:lang w:val="nl-NL"/>
-              </w:rPr>
-              <w:t>}}</w:t>
+              <w:t>{{form_33}}</w:t>
+            </w:r>
+            <w:r>
+              <w:rPr>
+                <w:bCs/>
+                <w:sz w:val="26"/>
+                <w:szCs w:val="26"/>
+                <w:lang w:val="nl-NL"/>
+              </w:rPr>
+              <w:t/>
+            </w:r>
+            <w:r>
+              <w:rPr>
+                <w:bCs/>
+                <w:sz w:val="26"/>
+                <w:szCs w:val="26"/>
+                <w:lang w:val="nl-NL"/>
+              </w:rPr>
+              <w:t/>
             </w:r>
             <w:r>
               <w:rPr>
@@ -2212,25 +2230,25 @@
                 <w:szCs w:val="26"/>
                 <w:lang w:val="nl-NL"/>
               </w:rPr>
-              <w:t>{{field_3</w:t>
-            </w:r>
-            <w:r>
-              <w:rPr>
-                <w:bCs/>
-                <w:sz w:val="26"/>
-                <w:szCs w:val="26"/>
-                <w:lang w:val="nl-NL"/>
-              </w:rPr>
-              <w:t>4</w:t>
-            </w:r>
-            <w:r>
-              <w:rPr>
-                <w:bCs/>
-                <w:sz w:val="26"/>
-                <w:szCs w:val="26"/>
-                <w:lang w:val="nl-NL"/>
-              </w:rPr>
-              <w:t xml:space="preserve">}} </w:t>
+              <w:t>{{form_34}}</w:t>
+            </w:r>
+            <w:r>
+              <w:rPr>
+                <w:bCs/>
+                <w:sz w:val="26"/>
+                <w:szCs w:val="26"/>
+                <w:lang w:val="nl-NL"/>
+              </w:rPr>
+              <w:t/>
+            </w:r>
+            <w:r>
+              <w:rPr>
+                <w:bCs/>
+                <w:sz w:val="26"/>
+                <w:szCs w:val="26"/>
+                <w:lang w:val="nl-NL"/>
+              </w:rPr>
+              <w:t xml:space="preserve"> </w:t>
             </w:r>
             <w:r>
               <w:rPr>
@@ -2248,25 +2266,25 @@
                 <w:szCs w:val="26"/>
                 <w:lang w:val="nl-NL"/>
               </w:rPr>
-              <w:t>{{field_3</w:t>
-            </w:r>
-            <w:r>
-              <w:rPr>
-                <w:bCs/>
-                <w:sz w:val="26"/>
-                <w:szCs w:val="26"/>
-                <w:lang w:val="nl-NL"/>
-              </w:rPr>
-              <w:t>5</w:t>
-            </w:r>
-            <w:r>
-              <w:rPr>
-                <w:bCs/>
-                <w:sz w:val="26"/>
-                <w:szCs w:val="26"/>
-                <w:lang w:val="nl-NL"/>
-              </w:rPr>
-              <w:t>}}</w:t>
+              <w:t>{{form_35}}</w:t>
+            </w:r>
+            <w:r>
+              <w:rPr>
+                <w:bCs/>
+                <w:sz w:val="26"/>
+                <w:szCs w:val="26"/>
+                <w:lang w:val="nl-NL"/>
+              </w:rPr>
+              <w:t/>
+            </w:r>
+            <w:r>
+              <w:rPr>
+                <w:bCs/>
+                <w:sz w:val="26"/>
+                <w:szCs w:val="26"/>
+                <w:lang w:val="nl-NL"/>
+              </w:rPr>
+              <w:t/>
             </w:r>
             <w:r>
               <w:rPr>
@@ -2284,25 +2302,25 @@
                 <w:szCs w:val="26"/>
                 <w:lang w:val="nl-NL"/>
               </w:rPr>
-              <w:t>{{field_3</w:t>
-            </w:r>
-            <w:r>
-              <w:rPr>
-                <w:bCs/>
-                <w:sz w:val="26"/>
-                <w:szCs w:val="26"/>
-                <w:lang w:val="nl-NL"/>
-              </w:rPr>
-              <w:t>6</w:t>
-            </w:r>
-            <w:r>
-              <w:rPr>
-                <w:bCs/>
-                <w:sz w:val="26"/>
-                <w:szCs w:val="26"/>
-                <w:lang w:val="nl-NL"/>
-              </w:rPr>
-              <w:t>}}</w:t>
+              <w:t>{{form_36}}</w:t>
+            </w:r>
+            <w:r>
+              <w:rPr>
+                <w:bCs/>
+                <w:sz w:val="26"/>
+                <w:szCs w:val="26"/>
+                <w:lang w:val="nl-NL"/>
+              </w:rPr>
+              <w:t/>
+            </w:r>
+            <w:r>
+              <w:rPr>
+                <w:bCs/>
+                <w:sz w:val="26"/>
+                <w:szCs w:val="26"/>
+                <w:lang w:val="nl-NL"/>
+              </w:rPr>
+              <w:t/>
             </w:r>
           </w:p>
           <w:tbl>
@@ -2535,19 +2553,19 @@
                     <w:rPr>
                       <w:sz w:val="22"/>
                     </w:rPr>
-                    <w:t>{{field_3</w:t>
+                    <w:t>{{form_38}}</w:t>
                   </w:r>
                   <w:r>
                     <w:rPr>
                       <w:sz w:val="22"/>
                     </w:rPr>
-                    <w:t>8</w:t>
+                    <w:t/>
                   </w:r>
                   <w:r>
                     <w:rPr>
                       <w:sz w:val="22"/>
                     </w:rPr>
-                    <w:t xml:space="preserve">}} </w:t>
+                    <w:t xml:space="preserve"> </w:t>
                   </w:r>
                   <w:r>
                     <w:rPr>
@@ -2661,6 +2679,7 @@
           </w:tbl>
           <w:p>
             <w:pPr>
+              <w:keepNext/>
               <w:spacing w:line="312" w:lineRule="auto"/>
               <w:rPr>
                 <w:szCs w:val="22"/>

</xml_diff>